<commit_message>
finish the exam prep
</commit_message>
<xml_diff>
--- a/Parallel Systems/Lectures/Lecture 5.docx
+++ b/Parallel Systems/Lectures/Lecture 5.docx
@@ -199,16 +199,7 @@
           <w:color w:val="000000" w:themeColor="text1"/>
           <w:u w:val="single"/>
         </w:rPr>
-        <w:t>Recap: Process Components</w:t>
-      </w:r>
-      <w:r>
-        <w:rPr>
-          <w:b/>
-          <w:bCs/>
-          <w:color w:val="000000" w:themeColor="text1"/>
-          <w:u w:val="single"/>
-        </w:rPr>
-        <w:t>:</w:t>
+        <w:t>Recap: Process Components:</w:t>
       </w:r>
     </w:p>
     <w:p>
@@ -244,16 +235,14 @@
         </w:rPr>
         <w:t xml:space="preserve">Stack, heap, the execution code aka code segment, global </w:t>
       </w:r>
-      <w:proofErr w:type="spellStart"/>
-      <w:r>
-        <w:rPr>
-          <w:color w:val="000000" w:themeColor="text1"/>
-          <w:sz w:val="22"/>
-          <w:szCs w:val="22"/>
-        </w:rPr>
-        <w:t>varibales</w:t>
-      </w:r>
-      <w:proofErr w:type="spellEnd"/>
+      <w:r>
+        <w:rPr>
+          <w:color w:val="000000" w:themeColor="text1"/>
+          <w:sz w:val="22"/>
+          <w:szCs w:val="22"/>
+        </w:rPr>
+        <w:t>variables</w:t>
+      </w:r>
       <w:r>
         <w:rPr>
           <w:color w:val="000000" w:themeColor="text1"/>
@@ -1916,7 +1905,25 @@
           <w:sz w:val="22"/>
           <w:szCs w:val="22"/>
         </w:rPr>
-        <w:t xml:space="preserve"> the kernel and the OS create a TCB which is the equivalence of creating a PCB for process it stores the metadata of each Thread; </w:t>
+        <w:t xml:space="preserve"> the kernel and the OS create a TCB which is the equivalence of creating a PCB for </w:t>
+      </w:r>
+      <w:proofErr w:type="gramStart"/>
+      <w:r>
+        <w:rPr>
+          <w:color w:val="000000" w:themeColor="text1"/>
+          <w:sz w:val="22"/>
+          <w:szCs w:val="22"/>
+        </w:rPr>
+        <w:t>process</w:t>
+      </w:r>
+      <w:proofErr w:type="gramEnd"/>
+      <w:r>
+        <w:rPr>
+          <w:color w:val="000000" w:themeColor="text1"/>
+          <w:sz w:val="22"/>
+          <w:szCs w:val="22"/>
+        </w:rPr>
+        <w:t xml:space="preserve"> it stores the metadata of each Thread; </w:t>
       </w:r>
       <w:r>
         <w:rPr>
@@ -2040,143 +2047,152 @@
           <w:color w:val="000000" w:themeColor="text1"/>
           <w:u w:val="single"/>
         </w:rPr>
-        <w:t>Thread Termination</w:t>
-      </w:r>
-      <w:r>
+        <w:t>Thread Termination:</w:t>
+      </w:r>
+    </w:p>
+    <w:p>
+      <w:pPr>
+        <w:rPr>
+          <w:color w:val="000000" w:themeColor="text1"/>
+          <w:sz w:val="22"/>
+          <w:szCs w:val="22"/>
+        </w:rPr>
+      </w:pPr>
+      <w:r>
+        <w:rPr>
+          <w:color w:val="000000" w:themeColor="text1"/>
+          <w:sz w:val="22"/>
+          <w:szCs w:val="22"/>
+        </w:rPr>
+        <w:t>A thread can finish and terminate normally or raise and exception and stop</w:t>
+      </w:r>
+    </w:p>
+    <w:p>
+      <w:pPr>
+        <w:rPr>
+          <w:color w:val="000000" w:themeColor="text1"/>
+          <w:sz w:val="22"/>
+          <w:szCs w:val="22"/>
+        </w:rPr>
+      </w:pPr>
+      <w:r>
+        <w:rPr>
+          <w:color w:val="000000" w:themeColor="text1"/>
+          <w:sz w:val="22"/>
+          <w:szCs w:val="22"/>
+        </w:rPr>
+        <w:lastRenderedPageBreak/>
+        <w:t xml:space="preserve">When </w:t>
+      </w:r>
+      <w:proofErr w:type="gramStart"/>
+      <w:r>
+        <w:rPr>
+          <w:color w:val="000000" w:themeColor="text1"/>
+          <w:sz w:val="22"/>
+          <w:szCs w:val="22"/>
+        </w:rPr>
+        <w:t>its</w:t>
+      </w:r>
+      <w:proofErr w:type="gramEnd"/>
+      <w:r>
+        <w:rPr>
+          <w:color w:val="000000" w:themeColor="text1"/>
+          <w:sz w:val="22"/>
+          <w:szCs w:val="22"/>
+        </w:rPr>
+        <w:t xml:space="preserve"> terminated the thread stack and Thread local storage are cleaned, the state is updated in the TCB</w:t>
+      </w:r>
+    </w:p>
+    <w:p>
+      <w:pPr>
+        <w:rPr>
+          <w:color w:val="000000" w:themeColor="text1"/>
+          <w:sz w:val="22"/>
+          <w:szCs w:val="22"/>
+        </w:rPr>
+      </w:pPr>
+      <w:r>
+        <w:rPr>
+          <w:color w:val="000000" w:themeColor="text1"/>
+          <w:sz w:val="22"/>
+          <w:szCs w:val="22"/>
+        </w:rPr>
+        <w:t xml:space="preserve">when the thread finishes either with an exception or normally the OS should send the return value and wake the </w:t>
+      </w:r>
+      <w:proofErr w:type="gramStart"/>
+      <w:r>
+        <w:rPr>
+          <w:color w:val="000000" w:themeColor="text1"/>
+          <w:sz w:val="22"/>
+          <w:szCs w:val="22"/>
+        </w:rPr>
+        <w:t>waiting(</w:t>
+      </w:r>
+      <w:proofErr w:type="gramEnd"/>
+      <w:r>
+        <w:rPr>
+          <w:color w:val="000000" w:themeColor="text1"/>
+          <w:sz w:val="22"/>
+          <w:szCs w:val="22"/>
+        </w:rPr>
+        <w:t>) threads for this terminated thread</w:t>
+      </w:r>
+    </w:p>
+    <w:p>
+      <w:pPr>
+        <w:rPr>
+          <w:color w:val="000000" w:themeColor="text1"/>
+          <w:sz w:val="22"/>
+          <w:szCs w:val="22"/>
+        </w:rPr>
+      </w:pPr>
+      <w:r>
+        <w:rPr>
+          <w:color w:val="000000" w:themeColor="text1"/>
+          <w:sz w:val="22"/>
+          <w:szCs w:val="22"/>
+        </w:rPr>
+        <w:t xml:space="preserve">last 2 steps </w:t>
+      </w:r>
+      <w:proofErr w:type="gramStart"/>
+      <w:r>
+        <w:rPr>
+          <w:color w:val="000000" w:themeColor="text1"/>
+          <w:sz w:val="22"/>
+          <w:szCs w:val="22"/>
+        </w:rPr>
+        <w:t>is</w:t>
+      </w:r>
+      <w:proofErr w:type="gramEnd"/>
+      <w:r>
+        <w:rPr>
+          <w:color w:val="000000" w:themeColor="text1"/>
+          <w:sz w:val="22"/>
+          <w:szCs w:val="22"/>
+        </w:rPr>
+        <w:t xml:space="preserve"> to delete it from the scheduling queue then delete it from the TCB</w:t>
+      </w:r>
+    </w:p>
+    <w:p>
+      <w:pPr>
         <w:rPr>
           <w:b/>
           <w:bCs/>
           <w:color w:val="000000" w:themeColor="text1"/>
-          <w:u w:val="single"/>
-        </w:rPr>
-        <w:t>:</w:t>
-      </w:r>
-    </w:p>
-    <w:p>
-      <w:pPr>
-        <w:rPr>
-          <w:color w:val="000000" w:themeColor="text1"/>
-          <w:sz w:val="22"/>
-          <w:szCs w:val="22"/>
-        </w:rPr>
-      </w:pPr>
-      <w:r>
-        <w:rPr>
-          <w:color w:val="000000" w:themeColor="text1"/>
-          <w:sz w:val="22"/>
-          <w:szCs w:val="22"/>
-        </w:rPr>
-        <w:t>A thread can finish and terminate normally or raise and exception and stop</w:t>
-      </w:r>
-    </w:p>
-    <w:p>
-      <w:pPr>
-        <w:rPr>
-          <w:color w:val="000000" w:themeColor="text1"/>
-          <w:sz w:val="22"/>
-          <w:szCs w:val="22"/>
-        </w:rPr>
-      </w:pPr>
-      <w:r>
-        <w:rPr>
-          <w:color w:val="000000" w:themeColor="text1"/>
-          <w:sz w:val="22"/>
-          <w:szCs w:val="22"/>
-        </w:rPr>
-        <w:lastRenderedPageBreak/>
-        <w:t xml:space="preserve">When </w:t>
-      </w:r>
-      <w:proofErr w:type="gramStart"/>
-      <w:r>
-        <w:rPr>
-          <w:color w:val="000000" w:themeColor="text1"/>
-          <w:sz w:val="22"/>
-          <w:szCs w:val="22"/>
-        </w:rPr>
-        <w:t>its</w:t>
-      </w:r>
-      <w:proofErr w:type="gramEnd"/>
-      <w:r>
-        <w:rPr>
-          <w:color w:val="000000" w:themeColor="text1"/>
-          <w:sz w:val="22"/>
-          <w:szCs w:val="22"/>
-        </w:rPr>
-        <w:t xml:space="preserve"> terminated the thread stack and Thread local storage are cleaned, the state is updated in the TCB</w:t>
-      </w:r>
-    </w:p>
-    <w:p>
-      <w:pPr>
-        <w:rPr>
-          <w:color w:val="000000" w:themeColor="text1"/>
-          <w:sz w:val="22"/>
-          <w:szCs w:val="22"/>
-        </w:rPr>
-      </w:pPr>
-      <w:r>
-        <w:rPr>
-          <w:color w:val="000000" w:themeColor="text1"/>
-          <w:sz w:val="22"/>
-          <w:szCs w:val="22"/>
-        </w:rPr>
-        <w:t xml:space="preserve">when the thread finishes either with an exception or normally the OS should send the return value and wake the </w:t>
-      </w:r>
-      <w:proofErr w:type="gramStart"/>
-      <w:r>
-        <w:rPr>
-          <w:color w:val="000000" w:themeColor="text1"/>
-          <w:sz w:val="22"/>
-          <w:szCs w:val="22"/>
-        </w:rPr>
-        <w:t>waiting(</w:t>
-      </w:r>
-      <w:proofErr w:type="gramEnd"/>
-      <w:r>
-        <w:rPr>
-          <w:color w:val="000000" w:themeColor="text1"/>
-          <w:sz w:val="22"/>
-          <w:szCs w:val="22"/>
-        </w:rPr>
-        <w:t>) threads for this terminated thread</w:t>
-      </w:r>
-    </w:p>
-    <w:p>
-      <w:pPr>
-        <w:rPr>
-          <w:color w:val="000000" w:themeColor="text1"/>
-          <w:sz w:val="22"/>
-          <w:szCs w:val="22"/>
-        </w:rPr>
-      </w:pPr>
-      <w:r>
-        <w:rPr>
-          <w:color w:val="000000" w:themeColor="text1"/>
-          <w:sz w:val="22"/>
-          <w:szCs w:val="22"/>
-        </w:rPr>
-        <w:t xml:space="preserve">last 2 steps </w:t>
-      </w:r>
-      <w:proofErr w:type="gramStart"/>
-      <w:r>
-        <w:rPr>
-          <w:color w:val="000000" w:themeColor="text1"/>
-          <w:sz w:val="22"/>
-          <w:szCs w:val="22"/>
-        </w:rPr>
-        <w:t>is</w:t>
-      </w:r>
-      <w:proofErr w:type="gramEnd"/>
-      <w:r>
-        <w:rPr>
-          <w:color w:val="000000" w:themeColor="text1"/>
-          <w:sz w:val="22"/>
-          <w:szCs w:val="22"/>
-        </w:rPr>
-        <w:t xml:space="preserve"> to delete it from the scheduling queue then delete it from the TCB</w:t>
-      </w:r>
-    </w:p>
-    <w:p>
-      <w:pPr>
+          <w:sz w:val="22"/>
+          <w:szCs w:val="22"/>
+        </w:rPr>
+      </w:pPr>
+    </w:p>
+    <w:p>
+      <w:pPr>
+        <w:rPr>
+          <w:color w:val="000000" w:themeColor="text1"/>
+          <w:sz w:val="22"/>
+          <w:szCs w:val="22"/>
+        </w:rPr>
+      </w:pPr>
+      <w:r>
         <w:rPr>
           <w:b/>
           <w:bCs/>
@@ -2184,16 +2200,9 @@
           <w:sz w:val="22"/>
           <w:szCs w:val="22"/>
         </w:rPr>
-      </w:pPr>
-    </w:p>
-    <w:p>
-      <w:pPr>
-        <w:rPr>
-          <w:color w:val="000000" w:themeColor="text1"/>
-          <w:sz w:val="22"/>
-          <w:szCs w:val="22"/>
-        </w:rPr>
-      </w:pPr>
+        <w:t xml:space="preserve">When to Use </w:t>
+      </w:r>
+      <w:proofErr w:type="gramStart"/>
       <w:r>
         <w:rPr>
           <w:b/>
@@ -2202,9 +2211,9 @@
           <w:sz w:val="22"/>
           <w:szCs w:val="22"/>
         </w:rPr>
-        <w:t xml:space="preserve">When to Use </w:t>
-      </w:r>
-      <w:proofErr w:type="gramStart"/>
+        <w:t>Threads?:</w:t>
+      </w:r>
+      <w:proofErr w:type="gramEnd"/>
       <w:r>
         <w:rPr>
           <w:b/>
@@ -2213,87 +2222,259 @@
           <w:sz w:val="22"/>
           <w:szCs w:val="22"/>
         </w:rPr>
-        <w:t>Threads?</w:t>
-      </w:r>
-      <w:r>
+        <w:t xml:space="preserve"> </w:t>
+      </w:r>
+    </w:p>
+    <w:p>
+      <w:pPr>
+        <w:rPr>
+          <w:color w:val="000000" w:themeColor="text1"/>
+          <w:sz w:val="22"/>
+          <w:szCs w:val="22"/>
+        </w:rPr>
+      </w:pPr>
+      <w:r>
+        <w:rPr>
+          <w:color w:val="000000" w:themeColor="text1"/>
+          <w:sz w:val="22"/>
+          <w:szCs w:val="22"/>
+        </w:rPr>
+        <w:t>When we need frequent access to shared resources, like global variables</w:t>
+      </w:r>
+    </w:p>
+    <w:p>
+      <w:pPr>
+        <w:rPr>
+          <w:color w:val="000000" w:themeColor="text1"/>
+          <w:sz w:val="22"/>
+          <w:szCs w:val="22"/>
+        </w:rPr>
+      </w:pPr>
+      <w:r>
+        <w:rPr>
+          <w:color w:val="000000" w:themeColor="text1"/>
+          <w:sz w:val="22"/>
+          <w:szCs w:val="22"/>
+        </w:rPr>
+        <w:t>For relatively short-lived concurrent tasks (benefit: fast creation and termination)</w:t>
+      </w:r>
+    </w:p>
+    <w:p>
+      <w:pPr>
+        <w:rPr>
+          <w:color w:val="000000" w:themeColor="text1"/>
+          <w:sz w:val="22"/>
+          <w:szCs w:val="22"/>
+        </w:rPr>
+      </w:pPr>
+      <w:r>
+        <w:rPr>
+          <w:color w:val="000000" w:themeColor="text1"/>
+          <w:sz w:val="22"/>
+          <w:szCs w:val="22"/>
+        </w:rPr>
+        <w:t xml:space="preserve">For input/output heavy tasks; </w:t>
+      </w:r>
+      <w:r>
+        <w:rPr>
+          <w:color w:val="000000" w:themeColor="text1"/>
+          <w:sz w:val="22"/>
+          <w:szCs w:val="22"/>
+        </w:rPr>
+        <w:t>are operations that spend most of their time waiting for external things (network, disk, database) rather than doing calculations.</w:t>
+      </w:r>
+    </w:p>
+    <w:p>
+      <w:pPr>
+        <w:rPr>
+          <w:color w:val="000000" w:themeColor="text1"/>
+          <w:sz w:val="22"/>
+          <w:szCs w:val="22"/>
+        </w:rPr>
+      </w:pPr>
+    </w:p>
+    <w:p>
+      <w:pPr>
         <w:rPr>
           <w:b/>
           <w:bCs/>
           <w:color w:val="000000" w:themeColor="text1"/>
-          <w:sz w:val="22"/>
-          <w:szCs w:val="22"/>
-        </w:rPr>
-        <w:t>:</w:t>
-      </w:r>
-      <w:proofErr w:type="gramEnd"/>
+          <w:u w:val="single"/>
+        </w:rPr>
+      </w:pPr>
       <w:r>
         <w:rPr>
           <w:b/>
           <w:bCs/>
           <w:color w:val="000000" w:themeColor="text1"/>
-          <w:sz w:val="22"/>
-          <w:szCs w:val="22"/>
-        </w:rPr>
-        <w:t xml:space="preserve"> </w:t>
-      </w:r>
-    </w:p>
-    <w:p>
-      <w:pPr>
-        <w:rPr>
-          <w:color w:val="000000" w:themeColor="text1"/>
-          <w:sz w:val="22"/>
-          <w:szCs w:val="22"/>
-        </w:rPr>
-      </w:pPr>
-      <w:r>
-        <w:rPr>
-          <w:color w:val="000000" w:themeColor="text1"/>
-          <w:sz w:val="22"/>
-          <w:szCs w:val="22"/>
-        </w:rPr>
-        <w:t>When we need frequent access to shared resources, like global variables</w:t>
-      </w:r>
-    </w:p>
-    <w:p>
-      <w:pPr>
-        <w:rPr>
-          <w:color w:val="000000" w:themeColor="text1"/>
-          <w:sz w:val="22"/>
-          <w:szCs w:val="22"/>
-        </w:rPr>
-      </w:pPr>
-      <w:r>
-        <w:rPr>
-          <w:color w:val="000000" w:themeColor="text1"/>
-          <w:sz w:val="22"/>
-          <w:szCs w:val="22"/>
-        </w:rPr>
-        <w:t>For relatively short-lived concurrent tasks (benefit: fast creation and termination)</w:t>
-      </w:r>
-    </w:p>
-    <w:p>
-      <w:pPr>
-        <w:rPr>
-          <w:color w:val="000000" w:themeColor="text1"/>
-          <w:sz w:val="22"/>
-          <w:szCs w:val="22"/>
-        </w:rPr>
-      </w:pPr>
-      <w:r>
-        <w:rPr>
-          <w:color w:val="000000" w:themeColor="text1"/>
-          <w:sz w:val="22"/>
-          <w:szCs w:val="22"/>
-        </w:rPr>
-        <w:t xml:space="preserve">For input/output heavy tasks; </w:t>
-      </w:r>
-      <w:r>
-        <w:rPr>
-          <w:color w:val="000000" w:themeColor="text1"/>
-          <w:sz w:val="22"/>
-          <w:szCs w:val="22"/>
-        </w:rPr>
-        <w:t>are operations that spend most of their time waiting for external things (network, disk, database) rather than doing calculations.</w:t>
+          <w:u w:val="single"/>
+        </w:rPr>
+        <w:t>Threads in Python:</w:t>
+      </w:r>
+    </w:p>
+    <w:p>
+      <w:pPr>
+        <w:rPr>
+          <w:color w:val="000000" w:themeColor="text1"/>
+          <w:sz w:val="22"/>
+          <w:szCs w:val="22"/>
+        </w:rPr>
+      </w:pPr>
+      <w:r>
+        <w:rPr>
+          <w:color w:val="000000" w:themeColor="text1"/>
+          <w:sz w:val="22"/>
+          <w:szCs w:val="22"/>
+        </w:rPr>
+        <w:t>Threads in python are not as light weight and as fast as they behave in operating systems since each process only gets one interpreter which means all the processes have a core to run on so threads in python don’t support parallelism but rather concurrency</w:t>
+      </w:r>
+    </w:p>
+    <w:p>
+      <w:pPr>
+        <w:rPr>
+          <w:color w:val="000000" w:themeColor="text1"/>
+          <w:sz w:val="22"/>
+          <w:szCs w:val="22"/>
+        </w:rPr>
+      </w:pPr>
+      <w:r>
+        <w:rPr>
+          <w:color w:val="000000" w:themeColor="text1"/>
+          <w:sz w:val="22"/>
+          <w:szCs w:val="22"/>
+        </w:rPr>
+        <w:t xml:space="preserve">For threading in </w:t>
+      </w:r>
+      <w:proofErr w:type="gramStart"/>
+      <w:r>
+        <w:rPr>
+          <w:color w:val="000000" w:themeColor="text1"/>
+          <w:sz w:val="22"/>
+          <w:szCs w:val="22"/>
+        </w:rPr>
+        <w:t>python</w:t>
+      </w:r>
+      <w:proofErr w:type="gramEnd"/>
+      <w:r>
+        <w:rPr>
+          <w:color w:val="000000" w:themeColor="text1"/>
+          <w:sz w:val="22"/>
+          <w:szCs w:val="22"/>
+        </w:rPr>
+        <w:t xml:space="preserve"> we use the library threading instead of multi-threading</w:t>
+      </w:r>
+    </w:p>
+    <w:p>
+      <w:pPr>
+        <w:rPr>
+          <w:color w:val="000000" w:themeColor="text1"/>
+          <w:sz w:val="22"/>
+          <w:szCs w:val="22"/>
+        </w:rPr>
+      </w:pPr>
+    </w:p>
+    <w:p>
+      <w:pPr>
+        <w:rPr>
+          <w:color w:val="000000" w:themeColor="text1"/>
+          <w:sz w:val="22"/>
+          <w:szCs w:val="22"/>
+        </w:rPr>
+      </w:pPr>
+      <w:r>
+        <w:rPr>
+          <w:color w:val="000000" w:themeColor="text1"/>
+          <w:sz w:val="22"/>
+          <w:szCs w:val="22"/>
+        </w:rPr>
+        <w:t xml:space="preserve">In </w:t>
+      </w:r>
+      <w:proofErr w:type="spellStart"/>
+      <w:r>
+        <w:rPr>
+          <w:color w:val="000000" w:themeColor="text1"/>
+          <w:sz w:val="22"/>
+          <w:szCs w:val="22"/>
+        </w:rPr>
+        <w:t>cpython</w:t>
+      </w:r>
+      <w:proofErr w:type="spellEnd"/>
+      <w:r>
+        <w:rPr>
+          <w:color w:val="000000" w:themeColor="text1"/>
+          <w:sz w:val="22"/>
+          <w:szCs w:val="22"/>
+        </w:rPr>
+        <w:t xml:space="preserve"> the interpreter is not thread safe we have a problem with running multiple threads at the same time which causes inconsistency so we have a global interpreter lock which is the equivalent of having a semaphore of one</w:t>
+      </w:r>
+    </w:p>
+    <w:p>
+      <w:pPr>
+        <w:rPr>
+          <w:color w:val="000000" w:themeColor="text1"/>
+          <w:sz w:val="22"/>
+          <w:szCs w:val="22"/>
+        </w:rPr>
+      </w:pPr>
+      <w:r>
+        <w:rPr>
+          <w:color w:val="000000" w:themeColor="text1"/>
+          <w:sz w:val="22"/>
+          <w:szCs w:val="22"/>
+        </w:rPr>
+        <w:t xml:space="preserve">As a </w:t>
+      </w:r>
+      <w:proofErr w:type="gramStart"/>
+      <w:r>
+        <w:rPr>
+          <w:color w:val="000000" w:themeColor="text1"/>
+          <w:sz w:val="22"/>
+          <w:szCs w:val="22"/>
+        </w:rPr>
+        <w:t>result</w:t>
+      </w:r>
+      <w:proofErr w:type="gramEnd"/>
+      <w:r>
+        <w:rPr>
+          <w:color w:val="000000" w:themeColor="text1"/>
+          <w:sz w:val="22"/>
+          <w:szCs w:val="22"/>
+        </w:rPr>
+        <w:t xml:space="preserve"> we get the concurrency but no parallelism,</w:t>
+      </w:r>
+    </w:p>
+    <w:p>
+      <w:pPr>
+        <w:rPr>
+          <w:color w:val="000000" w:themeColor="text1"/>
+          <w:sz w:val="22"/>
+          <w:szCs w:val="22"/>
+        </w:rPr>
+      </w:pPr>
+      <w:r>
+        <w:rPr>
+          <w:color w:val="000000" w:themeColor="text1"/>
+          <w:sz w:val="22"/>
+          <w:szCs w:val="22"/>
+        </w:rPr>
+        <w:t>The GIL or global interpreter lock is activated by default but we can manually deactivate it.</w:t>
+      </w:r>
+    </w:p>
+    <w:p>
+      <w:pPr>
+        <w:rPr>
+          <w:color w:val="000000" w:themeColor="text1"/>
+          <w:sz w:val="22"/>
+          <w:szCs w:val="22"/>
+        </w:rPr>
+      </w:pPr>
+      <w:r>
+        <w:rPr>
+          <w:color w:val="000000" w:themeColor="text1"/>
+          <w:sz w:val="22"/>
+          <w:szCs w:val="22"/>
+        </w:rPr>
+        <w:t>If we need to use parallelism we should use processes instead of threads.</w:t>
       </w:r>
     </w:p>
     <w:p>
@@ -2321,85 +2502,24 @@
           <w:color w:val="000000" w:themeColor="text1"/>
           <w:u w:val="single"/>
         </w:rPr>
-        <w:t>Threads in Python:</w:t>
-      </w:r>
-    </w:p>
-    <w:p>
-      <w:pPr>
-        <w:rPr>
-          <w:color w:val="000000" w:themeColor="text1"/>
-          <w:sz w:val="22"/>
-          <w:szCs w:val="22"/>
-        </w:rPr>
-      </w:pPr>
-      <w:r>
-        <w:rPr>
-          <w:color w:val="000000" w:themeColor="text1"/>
-          <w:sz w:val="22"/>
-          <w:szCs w:val="22"/>
-        </w:rPr>
-        <w:t>Threads in python are not as light weight and as fast as they behave in operating systems since each process only gets one interpreter which means all the processes have a core to run on so threads in python don’t support parallelism but rather concurrency</w:t>
-      </w:r>
-    </w:p>
-    <w:p>
-      <w:pPr>
-        <w:rPr>
-          <w:color w:val="000000" w:themeColor="text1"/>
-          <w:sz w:val="22"/>
-          <w:szCs w:val="22"/>
-        </w:rPr>
-      </w:pPr>
-      <w:r>
-        <w:rPr>
-          <w:color w:val="000000" w:themeColor="text1"/>
-          <w:sz w:val="22"/>
-          <w:szCs w:val="22"/>
-        </w:rPr>
-        <w:t xml:space="preserve">For threading in </w:t>
-      </w:r>
-      <w:proofErr w:type="gramStart"/>
-      <w:r>
-        <w:rPr>
-          <w:color w:val="000000" w:themeColor="text1"/>
-          <w:sz w:val="22"/>
-          <w:szCs w:val="22"/>
-        </w:rPr>
-        <w:t>python</w:t>
-      </w:r>
-      <w:proofErr w:type="gramEnd"/>
-      <w:r>
-        <w:rPr>
-          <w:color w:val="000000" w:themeColor="text1"/>
-          <w:sz w:val="22"/>
-          <w:szCs w:val="22"/>
-        </w:rPr>
-        <w:t xml:space="preserve"> we use the library threading instead of multi-threading</w:t>
-      </w:r>
-    </w:p>
-    <w:p>
-      <w:pPr>
-        <w:rPr>
-          <w:color w:val="000000" w:themeColor="text1"/>
-          <w:sz w:val="22"/>
-          <w:szCs w:val="22"/>
-        </w:rPr>
-      </w:pPr>
-    </w:p>
-    <w:p>
-      <w:pPr>
-        <w:rPr>
-          <w:color w:val="000000" w:themeColor="text1"/>
-          <w:sz w:val="22"/>
-          <w:szCs w:val="22"/>
-        </w:rPr>
-      </w:pPr>
-      <w:r>
-        <w:rPr>
-          <w:color w:val="000000" w:themeColor="text1"/>
-          <w:sz w:val="22"/>
-          <w:szCs w:val="22"/>
-        </w:rPr>
-        <w:t xml:space="preserve">In </w:t>
+        <w:t>Alternative Python Interpreter:</w:t>
+      </w:r>
+    </w:p>
+    <w:p>
+      <w:pPr>
+        <w:rPr>
+          <w:color w:val="000000" w:themeColor="text1"/>
+          <w:sz w:val="22"/>
+          <w:szCs w:val="22"/>
+        </w:rPr>
+      </w:pPr>
+      <w:r>
+        <w:rPr>
+          <w:color w:val="000000" w:themeColor="text1"/>
+          <w:sz w:val="22"/>
+          <w:szCs w:val="22"/>
+        </w:rPr>
+        <w:t xml:space="preserve">We have </w:t>
       </w:r>
       <w:proofErr w:type="spellStart"/>
       <w:r>
@@ -2408,7 +2528,7 @@
           <w:sz w:val="22"/>
           <w:szCs w:val="22"/>
         </w:rPr>
-        <w:t>cpython</w:t>
+        <w:t>pypy</w:t>
       </w:r>
       <w:proofErr w:type="spellEnd"/>
       <w:r>
@@ -2417,86 +2537,25 @@
           <w:sz w:val="22"/>
           <w:szCs w:val="22"/>
         </w:rPr>
-        <w:t xml:space="preserve"> the interpreter is not thread safe we have a problem with running multiple threads at the same time which causes inconsistency so we have a global interpreter lock which is the equivalent of having a semaphore of one</w:t>
-      </w:r>
-    </w:p>
-    <w:p>
-      <w:pPr>
-        <w:rPr>
-          <w:color w:val="000000" w:themeColor="text1"/>
-          <w:sz w:val="22"/>
-          <w:szCs w:val="22"/>
-        </w:rPr>
-      </w:pPr>
-      <w:r>
-        <w:rPr>
-          <w:color w:val="000000" w:themeColor="text1"/>
-          <w:sz w:val="22"/>
-          <w:szCs w:val="22"/>
-        </w:rPr>
-        <w:t xml:space="preserve">As a </w:t>
-      </w:r>
-      <w:proofErr w:type="gramStart"/>
-      <w:r>
-        <w:rPr>
-          <w:color w:val="000000" w:themeColor="text1"/>
-          <w:sz w:val="22"/>
-          <w:szCs w:val="22"/>
-        </w:rPr>
-        <w:t>result</w:t>
-      </w:r>
-      <w:proofErr w:type="gramEnd"/>
-      <w:r>
-        <w:rPr>
-          <w:color w:val="000000" w:themeColor="text1"/>
-          <w:sz w:val="22"/>
-          <w:szCs w:val="22"/>
-        </w:rPr>
-        <w:t xml:space="preserve"> we get the concurrency but no parallelism,</w:t>
-      </w:r>
-    </w:p>
-    <w:p>
-      <w:pPr>
-        <w:rPr>
-          <w:color w:val="000000" w:themeColor="text1"/>
-          <w:sz w:val="22"/>
-          <w:szCs w:val="22"/>
-        </w:rPr>
-      </w:pPr>
-      <w:r>
-        <w:rPr>
-          <w:color w:val="000000" w:themeColor="text1"/>
-          <w:sz w:val="22"/>
-          <w:szCs w:val="22"/>
-        </w:rPr>
-        <w:t>The GIL or global interpreter lock is activated by default but we can manually deactivate it.</w:t>
-      </w:r>
-    </w:p>
-    <w:p>
-      <w:pPr>
-        <w:rPr>
-          <w:color w:val="000000" w:themeColor="text1"/>
-          <w:sz w:val="22"/>
-          <w:szCs w:val="22"/>
-        </w:rPr>
-      </w:pPr>
-      <w:r>
-        <w:rPr>
-          <w:color w:val="000000" w:themeColor="text1"/>
-          <w:sz w:val="22"/>
-          <w:szCs w:val="22"/>
-        </w:rPr>
-        <w:t>If we need to use parallelism we should use processes instead of threads.</w:t>
-      </w:r>
-    </w:p>
-    <w:p>
-      <w:pPr>
-        <w:rPr>
-          <w:color w:val="000000" w:themeColor="text1"/>
-          <w:sz w:val="22"/>
-          <w:szCs w:val="22"/>
-        </w:rPr>
-      </w:pPr>
+        <w:t xml:space="preserve"> another interpreter for python that does not use GLI and support thread parallelism and other interprets however these interprets are not compatible with some popular libraries like NumPy</w:t>
+      </w:r>
+    </w:p>
+    <w:p>
+      <w:pPr>
+        <w:rPr>
+          <w:color w:val="000000" w:themeColor="text1"/>
+          <w:sz w:val="22"/>
+          <w:szCs w:val="22"/>
+        </w:rPr>
+      </w:pPr>
+      <w:r>
+        <w:rPr>
+          <w:color w:val="000000" w:themeColor="text1"/>
+          <w:sz w:val="22"/>
+          <w:szCs w:val="22"/>
+        </w:rPr>
+        <w:t>A friendly reminder that python is a very slow language.</w:t>
+      </w:r>
     </w:p>
     <w:p>
       <w:pPr>
@@ -2514,201 +2573,112 @@
           <w:color w:val="000000" w:themeColor="text1"/>
           <w:u w:val="single"/>
         </w:rPr>
-        <w:t>Alternative Python Interpreter</w:t>
-      </w:r>
-      <w:r>
+        <w:lastRenderedPageBreak/>
+        <w:t>When to Use Threads in Python:</w:t>
+      </w:r>
+    </w:p>
+    <w:p>
+      <w:pPr>
+        <w:rPr>
+          <w:color w:val="000000" w:themeColor="text1"/>
+          <w:sz w:val="22"/>
+          <w:szCs w:val="22"/>
+        </w:rPr>
+      </w:pPr>
+      <w:r>
+        <w:rPr>
+          <w:color w:val="000000" w:themeColor="text1"/>
+          <w:sz w:val="22"/>
+          <w:szCs w:val="22"/>
+        </w:rPr>
+        <w:t xml:space="preserve">When using threads in python our program does not run faster, </w:t>
+      </w:r>
+      <w:r>
+        <w:rPr>
+          <w:color w:val="000000" w:themeColor="text1"/>
+          <w:sz w:val="22"/>
+          <w:szCs w:val="22"/>
+        </w:rPr>
+        <w:t xml:space="preserve">especially </w:t>
+      </w:r>
+      <w:proofErr w:type="spellStart"/>
+      <w:r>
+        <w:rPr>
+          <w:color w:val="000000" w:themeColor="text1"/>
+          <w:sz w:val="22"/>
+          <w:szCs w:val="22"/>
+        </w:rPr>
+        <w:t>cpu</w:t>
+      </w:r>
+      <w:proofErr w:type="spellEnd"/>
+      <w:r>
+        <w:rPr>
+          <w:color w:val="000000" w:themeColor="text1"/>
+          <w:sz w:val="22"/>
+          <w:szCs w:val="22"/>
+        </w:rPr>
+        <w:t xml:space="preserve"> bound threads like calculations.</w:t>
+      </w:r>
+    </w:p>
+    <w:p>
+      <w:pPr>
+        <w:rPr>
+          <w:color w:val="000000" w:themeColor="text1"/>
+          <w:sz w:val="22"/>
+          <w:szCs w:val="22"/>
+        </w:rPr>
+      </w:pPr>
+      <w:r>
+        <w:rPr>
+          <w:color w:val="000000" w:themeColor="text1"/>
+          <w:sz w:val="22"/>
+          <w:szCs w:val="22"/>
+        </w:rPr>
+        <w:t xml:space="preserve">When to use threading, when we use </w:t>
+      </w:r>
+      <w:proofErr w:type="spellStart"/>
+      <w:r>
+        <w:rPr>
+          <w:color w:val="000000" w:themeColor="text1"/>
+          <w:sz w:val="22"/>
+          <w:szCs w:val="22"/>
+        </w:rPr>
+        <w:t>i</w:t>
+      </w:r>
+      <w:proofErr w:type="spellEnd"/>
+      <w:r>
+        <w:rPr>
+          <w:color w:val="000000" w:themeColor="text1"/>
+          <w:sz w:val="22"/>
+          <w:szCs w:val="22"/>
+        </w:rPr>
+        <w:t>/o waiting services, like waiting for the database or for the backend response</w:t>
+      </w:r>
+    </w:p>
+    <w:p>
+      <w:pPr>
+        <w:rPr>
+          <w:color w:val="000000" w:themeColor="text1"/>
+          <w:sz w:val="22"/>
+          <w:szCs w:val="22"/>
+        </w:rPr>
+      </w:pPr>
+    </w:p>
+    <w:p>
+      <w:pPr>
         <w:rPr>
           <w:b/>
           <w:bCs/>
           <w:color w:val="000000" w:themeColor="text1"/>
-          <w:u w:val="single"/>
-        </w:rPr>
-        <w:t>:</w:t>
-      </w:r>
-    </w:p>
-    <w:p>
-      <w:pPr>
-        <w:rPr>
-          <w:color w:val="000000" w:themeColor="text1"/>
-          <w:sz w:val="22"/>
-          <w:szCs w:val="22"/>
-        </w:rPr>
-      </w:pPr>
-      <w:r>
-        <w:rPr>
-          <w:color w:val="000000" w:themeColor="text1"/>
-          <w:sz w:val="22"/>
-          <w:szCs w:val="22"/>
-        </w:rPr>
-        <w:t xml:space="preserve">We have </w:t>
-      </w:r>
-      <w:proofErr w:type="spellStart"/>
-      <w:r>
-        <w:rPr>
-          <w:color w:val="000000" w:themeColor="text1"/>
-          <w:sz w:val="22"/>
-          <w:szCs w:val="22"/>
-        </w:rPr>
-        <w:t>pypy</w:t>
-      </w:r>
-      <w:proofErr w:type="spellEnd"/>
-      <w:r>
-        <w:rPr>
-          <w:color w:val="000000" w:themeColor="text1"/>
-          <w:sz w:val="22"/>
-          <w:szCs w:val="22"/>
-        </w:rPr>
-        <w:t xml:space="preserve"> another interpreter for python that does not use GLI and support thread parallelism and other interprets however these interprets are not compatible with some popular libraries like NumPy</w:t>
-      </w:r>
-    </w:p>
-    <w:p>
-      <w:pPr>
-        <w:rPr>
-          <w:color w:val="000000" w:themeColor="text1"/>
-          <w:sz w:val="22"/>
-          <w:szCs w:val="22"/>
-        </w:rPr>
-      </w:pPr>
-      <w:r>
-        <w:rPr>
-          <w:color w:val="000000" w:themeColor="text1"/>
-          <w:sz w:val="22"/>
-          <w:szCs w:val="22"/>
-        </w:rPr>
-        <w:t>A friendly reminder that python is a very slow language.</w:t>
-      </w:r>
-    </w:p>
-    <w:p>
-      <w:pPr>
+          <w:sz w:val="22"/>
+          <w:szCs w:val="22"/>
+        </w:rPr>
+      </w:pPr>
+      <w:r>
         <w:rPr>
           <w:b/>
           <w:bCs/>
           <w:color w:val="000000" w:themeColor="text1"/>
-          <w:u w:val="single"/>
-        </w:rPr>
-      </w:pPr>
-      <w:r>
-        <w:rPr>
-          <w:b/>
-          <w:bCs/>
-          <w:color w:val="000000" w:themeColor="text1"/>
-          <w:u w:val="single"/>
-        </w:rPr>
-        <w:lastRenderedPageBreak/>
-        <w:t>When to Use Threads in Python</w:t>
-      </w:r>
-      <w:r>
-        <w:rPr>
-          <w:b/>
-          <w:bCs/>
-          <w:color w:val="000000" w:themeColor="text1"/>
-          <w:u w:val="single"/>
-        </w:rPr>
-        <w:t>:</w:t>
-      </w:r>
-    </w:p>
-    <w:p>
-      <w:pPr>
-        <w:rPr>
-          <w:color w:val="000000" w:themeColor="text1"/>
-          <w:sz w:val="22"/>
-          <w:szCs w:val="22"/>
-        </w:rPr>
-      </w:pPr>
-      <w:r>
-        <w:rPr>
-          <w:color w:val="000000" w:themeColor="text1"/>
-          <w:sz w:val="22"/>
-          <w:szCs w:val="22"/>
-        </w:rPr>
-        <w:t xml:space="preserve">When using threads in python our program does not run faster, </w:t>
-      </w:r>
-      <w:r>
-        <w:rPr>
-          <w:color w:val="000000" w:themeColor="text1"/>
-          <w:sz w:val="22"/>
-          <w:szCs w:val="22"/>
-        </w:rPr>
-        <w:t xml:space="preserve">especially </w:t>
-      </w:r>
-      <w:proofErr w:type="spellStart"/>
-      <w:r>
-        <w:rPr>
-          <w:color w:val="000000" w:themeColor="text1"/>
-          <w:sz w:val="22"/>
-          <w:szCs w:val="22"/>
-        </w:rPr>
-        <w:t>cpu</w:t>
-      </w:r>
-      <w:proofErr w:type="spellEnd"/>
-      <w:r>
-        <w:rPr>
-          <w:color w:val="000000" w:themeColor="text1"/>
-          <w:sz w:val="22"/>
-          <w:szCs w:val="22"/>
-        </w:rPr>
-        <w:t xml:space="preserve"> bound threads like calculations.</w:t>
-      </w:r>
-    </w:p>
-    <w:p>
-      <w:pPr>
-        <w:rPr>
-          <w:color w:val="000000" w:themeColor="text1"/>
-          <w:sz w:val="22"/>
-          <w:szCs w:val="22"/>
-        </w:rPr>
-      </w:pPr>
-      <w:r>
-        <w:rPr>
-          <w:color w:val="000000" w:themeColor="text1"/>
-          <w:sz w:val="22"/>
-          <w:szCs w:val="22"/>
-        </w:rPr>
-        <w:t xml:space="preserve">When to use threading, when we use </w:t>
-      </w:r>
-      <w:proofErr w:type="spellStart"/>
-      <w:r>
-        <w:rPr>
-          <w:color w:val="000000" w:themeColor="text1"/>
-          <w:sz w:val="22"/>
-          <w:szCs w:val="22"/>
-        </w:rPr>
-        <w:t>i</w:t>
-      </w:r>
-      <w:proofErr w:type="spellEnd"/>
-      <w:r>
-        <w:rPr>
-          <w:color w:val="000000" w:themeColor="text1"/>
-          <w:sz w:val="22"/>
-          <w:szCs w:val="22"/>
-        </w:rPr>
-        <w:t>/o waiting services, like waiting for the database or for the backend response</w:t>
-      </w:r>
-    </w:p>
-    <w:p>
-      <w:pPr>
-        <w:rPr>
-          <w:color w:val="000000" w:themeColor="text1"/>
-          <w:sz w:val="22"/>
-          <w:szCs w:val="22"/>
-        </w:rPr>
-      </w:pPr>
-    </w:p>
-    <w:p>
-      <w:pPr>
-        <w:rPr>
-          <w:b/>
-          <w:bCs/>
-          <w:color w:val="000000" w:themeColor="text1"/>
-          <w:sz w:val="22"/>
-          <w:szCs w:val="22"/>
-        </w:rPr>
-      </w:pPr>
-      <w:r>
-        <w:rPr>
-          <w:b/>
-          <w:bCs/>
-          <w:color w:val="000000" w:themeColor="text1"/>
           <w:sz w:val="22"/>
           <w:szCs w:val="22"/>
         </w:rPr>
@@ -2970,7 +2940,25 @@
           <w:sz w:val="22"/>
           <w:szCs w:val="22"/>
         </w:rPr>
-        <w:t xml:space="preserve">The execution order of the threads is un-predictable when a thread is interrupted via </w:t>
+        <w:t xml:space="preserve">The execution order of the threads is </w:t>
+      </w:r>
+      <w:proofErr w:type="gramStart"/>
+      <w:r>
+        <w:rPr>
+          <w:color w:val="000000" w:themeColor="text1"/>
+          <w:sz w:val="22"/>
+          <w:szCs w:val="22"/>
+        </w:rPr>
+        <w:t>un-predictable</w:t>
+      </w:r>
+      <w:proofErr w:type="gramEnd"/>
+      <w:r>
+        <w:rPr>
+          <w:color w:val="000000" w:themeColor="text1"/>
+          <w:sz w:val="22"/>
+          <w:szCs w:val="22"/>
+        </w:rPr>
+        <w:t xml:space="preserve"> when a thread is interrupted via </w:t>
       </w:r>
       <w:proofErr w:type="spellStart"/>
       <w:proofErr w:type="gramStart"/>
@@ -3178,7 +3166,43 @@
           <w:sz w:val="22"/>
           <w:szCs w:val="22"/>
         </w:rPr>
-        <w:t>() makes the main thread waits for this particular thread until it finishes.</w:t>
+        <w:t xml:space="preserve">() makes the main thread </w:t>
+      </w:r>
+      <w:proofErr w:type="gramStart"/>
+      <w:r>
+        <w:rPr>
+          <w:color w:val="000000" w:themeColor="text1"/>
+          <w:sz w:val="22"/>
+          <w:szCs w:val="22"/>
+        </w:rPr>
+        <w:t>waits</w:t>
+      </w:r>
+      <w:proofErr w:type="gramEnd"/>
+      <w:r>
+        <w:rPr>
+          <w:color w:val="000000" w:themeColor="text1"/>
+          <w:sz w:val="22"/>
+          <w:szCs w:val="22"/>
+        </w:rPr>
+        <w:t xml:space="preserve"> for this </w:t>
+      </w:r>
+      <w:proofErr w:type="gramStart"/>
+      <w:r>
+        <w:rPr>
+          <w:color w:val="000000" w:themeColor="text1"/>
+          <w:sz w:val="22"/>
+          <w:szCs w:val="22"/>
+        </w:rPr>
+        <w:t>particular thread</w:t>
+      </w:r>
+      <w:proofErr w:type="gramEnd"/>
+      <w:r>
+        <w:rPr>
+          <w:color w:val="000000" w:themeColor="text1"/>
+          <w:sz w:val="22"/>
+          <w:szCs w:val="22"/>
+        </w:rPr>
+        <w:t xml:space="preserve"> until it finishes.</w:t>
       </w:r>
     </w:p>
     <w:p>
@@ -4059,6 +4083,7 @@
   <w:style w:type="character" w:default="1" w:styleId="DefaultParagraphFont">
     <w:name w:val="Default Paragraph Font"/>
     <w:uiPriority w:val="1"/>
+    <w:semiHidden/>
     <w:unhideWhenUsed/>
   </w:style>
   <w:style w:type="table" w:default="1" w:styleId="TableNormal">

</xml_diff>